<commit_message>
docs: explain architecture and development cost
</commit_message>
<xml_diff>
--- a/docs/deliverables/Postcards Руководство пользователя.docx
+++ b/docs/deliverables/Postcards Руководство пользователя.docx
@@ -99,7 +99,7 @@
         </w:rPr>
         <w:t>Версия приложения 2.0.2</w:t>
         <w:br/>
-        <w:t>Редакция руководства 18 октября 2026 года</w:t>
+        <w:t>Редакция руководства 19 октября 2026 года</w:t>
       </w:r>
     </w:p>
     <w:p>
@@ -161,6 +161,886 @@
           <w:color w:val="000000"/>
         </w:rPr>
         <w:t>На отдельных снимках может отображаться тестовый адрес. Рабочий адрес координатора для всех клиентских компьютеров: http://192.168.88.54:8787.</w:t>
+      </w:r>
+    </w:p>
+    <w:p>
+      <w:pPr>
+        <w:pStyle w:val="Heading1"/>
+        <w:keepNext/>
+      </w:pPr>
+      <w:r>
+        <w:t>Что создано и какие задачи решает система</w:t>
+      </w:r>
+    </w:p>
+    <w:p>
+      <w:pPr>
+        <w:spacing w:after="120" w:line="269" w:lineRule="auto"/>
+      </w:pPr>
+      <w:r>
+        <w:rPr>
+          <w:rFonts w:ascii="Aptos" w:hAnsi="Aptos" w:eastAsia="Aptos"/>
+          <w:i w:val="0"/>
+          <w:color w:val="000000"/>
+        </w:rPr>
+        <w:t>Postcards состоит из двух связанных приложений. Веб-сервис Postcards Studio помогает музейным сотрудникам совместно готовить четыре документа и публиковать согласованный комплект PDF. Десктопное приложение принимает этот комплект на выставке и управляет показом на четырёх компьютерах. Такое разделение позволяет редактировать материалы удалённо, а саму инсталляцию запускать в локальной сети и продолжать показ при временном отсутствии интернета.</w:t>
+      </w:r>
+    </w:p>
+    <w:tbl>
+      <w:tblPr>
+        <w:tblW w:type="auto" w:w="0"/>
+        <w:jc w:val="center"/>
+        <w:tblLayout w:type="fixed"/>
+        <w:tblLook w:firstColumn="1" w:firstRow="1" w:lastColumn="0" w:lastRow="0" w:noHBand="0" w:noVBand="1" w:val="04A0"/>
+        <w:tblBorders>
+          <w:top w:val="single" w:sz="6" w:space="0" w:color="D9D9D9"/>
+          <w:left w:val="single" w:sz="6" w:space="0" w:color="D9D9D9"/>
+          <w:bottom w:val="single" w:sz="6" w:space="0" w:color="D9D9D9"/>
+          <w:right w:val="single" w:sz="6" w:space="0" w:color="D9D9D9"/>
+          <w:insideH w:val="single" w:sz="6" w:space="0" w:color="D9D9D9"/>
+          <w:insideV w:val="single" w:sz="6" w:space="0" w:color="D9D9D9"/>
+        </w:tblBorders>
+      </w:tblPr>
+      <w:tblGrid>
+        <w:gridCol w:w="3389"/>
+        <w:gridCol w:w="3389"/>
+        <w:gridCol w:w="3389"/>
+      </w:tblGrid>
+      <w:tr>
+        <w:trPr>
+          <w:tblHeader w:val="true"/>
+          <w:cantSplit/>
+        </w:trPr>
+        <w:tc>
+          <w:tcPr>
+            <w:tcW w:type="dxa" w:w="1944"/>
+            <w:shd w:fill="243B53"/>
+            <w:tcMar>
+              <w:top w:w="110" w:type="dxa"/>
+              <w:start w:w="120" w:type="dxa"/>
+              <w:bottom w:w="110" w:type="dxa"/>
+              <w:end w:w="120" w:type="dxa"/>
+            </w:tcMar>
+            <w:vAlign w:val="center"/>
+          </w:tcPr>
+          <w:p>
+            <w:pPr>
+              <w:jc w:val="center"/>
+            </w:pPr>
+            <w:r>
+              <w:rPr>
+                <w:rFonts w:ascii="Aptos" w:hAnsi="Aptos" w:eastAsia="Aptos"/>
+                <w:b/>
+                <w:color w:val="FFFFFF"/>
+                <w:sz w:val="20"/>
+              </w:rPr>
+              <w:t>Часть системы</w:t>
+            </w:r>
+          </w:p>
+        </w:tc>
+        <w:tc>
+          <w:tcPr>
+            <w:tcW w:type="dxa" w:w="3960"/>
+            <w:shd w:fill="243B53"/>
+            <w:tcMar>
+              <w:top w:w="110" w:type="dxa"/>
+              <w:start w:w="120" w:type="dxa"/>
+              <w:bottom w:w="110" w:type="dxa"/>
+              <w:end w:w="120" w:type="dxa"/>
+            </w:tcMar>
+            <w:vAlign w:val="center"/>
+          </w:tcPr>
+          <w:p>
+            <w:pPr>
+              <w:jc w:val="center"/>
+            </w:pPr>
+            <w:r>
+              <w:rPr>
+                <w:rFonts w:ascii="Aptos" w:hAnsi="Aptos" w:eastAsia="Aptos"/>
+                <w:b/>
+                <w:color w:val="FFFFFF"/>
+                <w:sz w:val="20"/>
+              </w:rPr>
+              <w:t>Что делает</w:t>
+            </w:r>
+          </w:p>
+        </w:tc>
+        <w:tc>
+          <w:tcPr>
+            <w:tcW w:type="dxa" w:w="3816"/>
+            <w:shd w:fill="243B53"/>
+            <w:tcMar>
+              <w:top w:w="110" w:type="dxa"/>
+              <w:start w:w="120" w:type="dxa"/>
+              <w:bottom w:w="110" w:type="dxa"/>
+              <w:end w:w="120" w:type="dxa"/>
+            </w:tcMar>
+            <w:vAlign w:val="center"/>
+          </w:tcPr>
+          <w:p>
+            <w:pPr>
+              <w:jc w:val="center"/>
+            </w:pPr>
+            <w:r>
+              <w:rPr>
+                <w:rFonts w:ascii="Aptos" w:hAnsi="Aptos" w:eastAsia="Aptos"/>
+                <w:b/>
+                <w:color w:val="FFFFFF"/>
+                <w:sz w:val="20"/>
+              </w:rPr>
+              <w:t>Зачем нужна</w:t>
+            </w:r>
+          </w:p>
+        </w:tc>
+      </w:tr>
+      <w:tr>
+        <w:trPr>
+          <w:cantSplit/>
+        </w:trPr>
+        <w:tc>
+          <w:tcPr>
+            <w:tcW w:type="dxa" w:w="1944"/>
+            <w:tcMar>
+              <w:top w:w="110" w:type="dxa"/>
+              <w:start w:w="120" w:type="dxa"/>
+              <w:bottom w:w="110" w:type="dxa"/>
+              <w:end w:w="120" w:type="dxa"/>
+            </w:tcMar>
+            <w:vAlign w:val="center"/>
+          </w:tcPr>
+          <w:p>
+            <w:pPr>
+              <w:spacing w:after="0"/>
+              <w:jc w:val="center"/>
+            </w:pPr>
+            <w:r>
+              <w:rPr>
+                <w:rFonts w:ascii="Aptos" w:hAnsi="Aptos" w:eastAsia="Aptos"/>
+                <w:color w:val="000000"/>
+                <w:sz w:val="19"/>
+              </w:rPr>
+              <w:t>Веб-интерфейс</w:t>
+            </w:r>
+          </w:p>
+        </w:tc>
+        <w:tc>
+          <w:tcPr>
+            <w:tcW w:type="dxa" w:w="3960"/>
+            <w:tcMar>
+              <w:top w:w="110" w:type="dxa"/>
+              <w:start w:w="120" w:type="dxa"/>
+              <w:bottom w:w="110" w:type="dxa"/>
+              <w:end w:w="120" w:type="dxa"/>
+            </w:tcMar>
+            <w:vAlign w:val="center"/>
+          </w:tcPr>
+          <w:p>
+            <w:pPr>
+              <w:spacing w:after="0"/>
+              <w:jc w:val="left"/>
+            </w:pPr>
+            <w:r>
+              <w:rPr>
+                <w:rFonts w:ascii="Aptos" w:hAnsi="Aptos" w:eastAsia="Aptos"/>
+                <w:color w:val="000000"/>
+                <w:sz w:val="19"/>
+              </w:rPr>
+              <w:t>Открывает четыре документа, макет, историю и публикацию в браузере.</w:t>
+            </w:r>
+          </w:p>
+        </w:tc>
+        <w:tc>
+          <w:tcPr>
+            <w:tcW w:type="dxa" w:w="3816"/>
+            <w:tcMar>
+              <w:top w:w="110" w:type="dxa"/>
+              <w:start w:w="120" w:type="dxa"/>
+              <w:bottom w:w="110" w:type="dxa"/>
+              <w:end w:w="120" w:type="dxa"/>
+            </w:tcMar>
+            <w:vAlign w:val="center"/>
+          </w:tcPr>
+          <w:p>
+            <w:pPr>
+              <w:spacing w:after="0"/>
+              <w:jc w:val="left"/>
+            </w:pPr>
+            <w:r>
+              <w:rPr>
+                <w:rFonts w:ascii="Aptos" w:hAnsi="Aptos" w:eastAsia="Aptos"/>
+                <w:color w:val="000000"/>
+                <w:sz w:val="19"/>
+              </w:rPr>
+              <w:t>Не нужно ставить редактор макетов на каждый компьютер и пересылать рабочие файлы.</w:t>
+            </w:r>
+          </w:p>
+        </w:tc>
+      </w:tr>
+      <w:tr>
+        <w:trPr>
+          <w:cantSplit/>
+        </w:trPr>
+        <w:tc>
+          <w:tcPr>
+            <w:tcW w:type="dxa" w:w="1944"/>
+            <w:shd w:fill="EEF4F8"/>
+            <w:tcMar>
+              <w:top w:w="110" w:type="dxa"/>
+              <w:start w:w="120" w:type="dxa"/>
+              <w:bottom w:w="110" w:type="dxa"/>
+              <w:end w:w="120" w:type="dxa"/>
+            </w:tcMar>
+            <w:vAlign w:val="center"/>
+          </w:tcPr>
+          <w:p>
+            <w:pPr>
+              <w:spacing w:after="0"/>
+              <w:jc w:val="center"/>
+            </w:pPr>
+            <w:r>
+              <w:rPr>
+                <w:rFonts w:ascii="Aptos" w:hAnsi="Aptos" w:eastAsia="Aptos"/>
+                <w:color w:val="000000"/>
+                <w:sz w:val="19"/>
+              </w:rPr>
+              <w:t>Домен и HTTPS</w:t>
+            </w:r>
+          </w:p>
+        </w:tc>
+        <w:tc>
+          <w:tcPr>
+            <w:tcW w:type="dxa" w:w="3960"/>
+            <w:shd w:fill="EEF4F8"/>
+            <w:tcMar>
+              <w:top w:w="110" w:type="dxa"/>
+              <w:start w:w="120" w:type="dxa"/>
+              <w:bottom w:w="110" w:type="dxa"/>
+              <w:end w:w="120" w:type="dxa"/>
+            </w:tcMar>
+            <w:vAlign w:val="center"/>
+          </w:tcPr>
+          <w:p>
+            <w:pPr>
+              <w:spacing w:after="0"/>
+              <w:jc w:val="left"/>
+            </w:pPr>
+            <w:r>
+              <w:rPr>
+                <w:rFonts w:ascii="Aptos" w:hAnsi="Aptos" w:eastAsia="Aptos"/>
+                <w:color w:val="000000"/>
+                <w:sz w:val="19"/>
+              </w:rPr>
+              <w:t>Даёт постоянный адрес mess-studio.ru и шифрует соединение.</w:t>
+            </w:r>
+          </w:p>
+        </w:tc>
+        <w:tc>
+          <w:tcPr>
+            <w:tcW w:type="dxa" w:w="3816"/>
+            <w:shd w:fill="EEF4F8"/>
+            <w:tcMar>
+              <w:top w:w="110" w:type="dxa"/>
+              <w:start w:w="120" w:type="dxa"/>
+              <w:bottom w:w="110" w:type="dxa"/>
+              <w:end w:w="120" w:type="dxa"/>
+            </w:tcMar>
+            <w:vAlign w:val="center"/>
+          </w:tcPr>
+          <w:p>
+            <w:pPr>
+              <w:spacing w:after="0"/>
+              <w:jc w:val="left"/>
+            </w:pPr>
+            <w:r>
+              <w:rPr>
+                <w:rFonts w:ascii="Aptos" w:hAnsi="Aptos" w:eastAsia="Aptos"/>
+                <w:color w:val="000000"/>
+                <w:sz w:val="19"/>
+              </w:rPr>
+              <w:t>Адрес не зависит от IP сервера, а учётные данные не передаются открытым текстом.</w:t>
+            </w:r>
+          </w:p>
+        </w:tc>
+      </w:tr>
+      <w:tr>
+        <w:trPr>
+          <w:cantSplit/>
+        </w:trPr>
+        <w:tc>
+          <w:tcPr>
+            <w:tcW w:type="dxa" w:w="1944"/>
+            <w:tcMar>
+              <w:top w:w="110" w:type="dxa"/>
+              <w:start w:w="120" w:type="dxa"/>
+              <w:bottom w:w="110" w:type="dxa"/>
+              <w:end w:w="120" w:type="dxa"/>
+            </w:tcMar>
+            <w:vAlign w:val="center"/>
+          </w:tcPr>
+          <w:p>
+            <w:pPr>
+              <w:spacing w:after="0"/>
+              <w:jc w:val="center"/>
+            </w:pPr>
+            <w:r>
+              <w:rPr>
+                <w:rFonts w:ascii="Aptos" w:hAnsi="Aptos" w:eastAsia="Aptos"/>
+                <w:color w:val="000000"/>
+                <w:sz w:val="19"/>
+              </w:rPr>
+              <w:t>Сервер</w:t>
+            </w:r>
+          </w:p>
+        </w:tc>
+        <w:tc>
+          <w:tcPr>
+            <w:tcW w:type="dxa" w:w="3960"/>
+            <w:tcMar>
+              <w:top w:w="110" w:type="dxa"/>
+              <w:start w:w="120" w:type="dxa"/>
+              <w:bottom w:w="110" w:type="dxa"/>
+              <w:end w:w="120" w:type="dxa"/>
+            </w:tcMar>
+            <w:vAlign w:val="center"/>
+          </w:tcPr>
+          <w:p>
+            <w:pPr>
+              <w:spacing w:after="0"/>
+              <w:jc w:val="left"/>
+            </w:pPr>
+            <w:r>
+              <w:rPr>
+                <w:rFonts w:ascii="Aptos" w:hAnsi="Aptos" w:eastAsia="Aptos"/>
+                <w:color w:val="000000"/>
+                <w:sz w:val="19"/>
+              </w:rPr>
+              <w:t>Принимает правки, координирует совместную работу и собирает PDF.</w:t>
+            </w:r>
+          </w:p>
+        </w:tc>
+        <w:tc>
+          <w:tcPr>
+            <w:tcW w:type="dxa" w:w="3816"/>
+            <w:tcMar>
+              <w:top w:w="110" w:type="dxa"/>
+              <w:start w:w="120" w:type="dxa"/>
+              <w:bottom w:w="110" w:type="dxa"/>
+              <w:end w:w="120" w:type="dxa"/>
+            </w:tcMar>
+            <w:vAlign w:val="center"/>
+          </w:tcPr>
+          <w:p>
+            <w:pPr>
+              <w:spacing w:after="0"/>
+              <w:jc w:val="left"/>
+            </w:pPr>
+            <w:r>
+              <w:rPr>
+                <w:rFonts w:ascii="Aptos" w:hAnsi="Aptos" w:eastAsia="Aptos"/>
+                <w:color w:val="000000"/>
+                <w:sz w:val="19"/>
+              </w:rPr>
+              <w:t>Общее состояние доступно уполномоченным сотрудникам из разных помещений и городов.</w:t>
+            </w:r>
+          </w:p>
+        </w:tc>
+      </w:tr>
+      <w:tr>
+        <w:trPr>
+          <w:cantSplit/>
+        </w:trPr>
+        <w:tc>
+          <w:tcPr>
+            <w:tcW w:type="dxa" w:w="1944"/>
+            <w:shd w:fill="EEF4F8"/>
+            <w:tcMar>
+              <w:top w:w="110" w:type="dxa"/>
+              <w:start w:w="120" w:type="dxa"/>
+              <w:bottom w:w="110" w:type="dxa"/>
+              <w:end w:w="120" w:type="dxa"/>
+            </w:tcMar>
+            <w:vAlign w:val="center"/>
+          </w:tcPr>
+          <w:p>
+            <w:pPr>
+              <w:spacing w:after="0"/>
+              <w:jc w:val="center"/>
+            </w:pPr>
+            <w:r>
+              <w:rPr>
+                <w:rFonts w:ascii="Aptos" w:hAnsi="Aptos" w:eastAsia="Aptos"/>
+                <w:color w:val="000000"/>
+                <w:sz w:val="19"/>
+              </w:rPr>
+              <w:t>База данных и хранилище</w:t>
+            </w:r>
+          </w:p>
+        </w:tc>
+        <w:tc>
+          <w:tcPr>
+            <w:tcW w:type="dxa" w:w="3960"/>
+            <w:shd w:fill="EEF4F8"/>
+            <w:tcMar>
+              <w:top w:w="110" w:type="dxa"/>
+              <w:start w:w="120" w:type="dxa"/>
+              <w:bottom w:w="110" w:type="dxa"/>
+              <w:end w:w="120" w:type="dxa"/>
+            </w:tcMar>
+            <w:vAlign w:val="center"/>
+          </w:tcPr>
+          <w:p>
+            <w:pPr>
+              <w:spacing w:after="0"/>
+              <w:jc w:val="left"/>
+            </w:pPr>
+            <w:r>
+              <w:rPr>
+                <w:rFonts w:ascii="Aptos" w:hAnsi="Aptos" w:eastAsia="Aptos"/>
+                <w:color w:val="000000"/>
+                <w:sz w:val="19"/>
+              </w:rPr>
+              <w:t>Хранят пользователей, роли, документы, версии, сканы и публикации.</w:t>
+            </w:r>
+          </w:p>
+        </w:tc>
+        <w:tc>
+          <w:tcPr>
+            <w:tcW w:type="dxa" w:w="3816"/>
+            <w:shd w:fill="EEF4F8"/>
+            <w:tcMar>
+              <w:top w:w="110" w:type="dxa"/>
+              <w:start w:w="120" w:type="dxa"/>
+              <w:bottom w:w="110" w:type="dxa"/>
+              <w:end w:w="120" w:type="dxa"/>
+            </w:tcMar>
+            <w:vAlign w:val="center"/>
+          </w:tcPr>
+          <w:p>
+            <w:pPr>
+              <w:spacing w:after="0"/>
+              <w:jc w:val="left"/>
+            </w:pPr>
+            <w:r>
+              <w:rPr>
+                <w:rFonts w:ascii="Aptos" w:hAnsi="Aptos" w:eastAsia="Aptos"/>
+                <w:color w:val="000000"/>
+                <w:sz w:val="19"/>
+              </w:rPr>
+              <w:t>Можно восстановить контрольную версию и проверить опубликованный комплект.</w:t>
+            </w:r>
+          </w:p>
+        </w:tc>
+      </w:tr>
+      <w:tr>
+        <w:trPr>
+          <w:cantSplit/>
+        </w:trPr>
+        <w:tc>
+          <w:tcPr>
+            <w:tcW w:type="dxa" w:w="1944"/>
+            <w:tcMar>
+              <w:top w:w="110" w:type="dxa"/>
+              <w:start w:w="120" w:type="dxa"/>
+              <w:bottom w:w="110" w:type="dxa"/>
+              <w:end w:w="120" w:type="dxa"/>
+            </w:tcMar>
+            <w:vAlign w:val="center"/>
+          </w:tcPr>
+          <w:p>
+            <w:pPr>
+              <w:spacing w:after="0"/>
+              <w:jc w:val="center"/>
+            </w:pPr>
+            <w:r>
+              <w:rPr>
+                <w:rFonts w:ascii="Aptos" w:hAnsi="Aptos" w:eastAsia="Aptos"/>
+                <w:color w:val="000000"/>
+                <w:sz w:val="19"/>
+              </w:rPr>
+              <w:t>NAS и Яндекс Диск</w:t>
+            </w:r>
+          </w:p>
+        </w:tc>
+        <w:tc>
+          <w:tcPr>
+            <w:tcW w:type="dxa" w:w="3960"/>
+            <w:tcMar>
+              <w:top w:w="110" w:type="dxa"/>
+              <w:start w:w="120" w:type="dxa"/>
+              <w:bottom w:w="110" w:type="dxa"/>
+              <w:end w:w="120" w:type="dxa"/>
+            </w:tcMar>
+            <w:vAlign w:val="center"/>
+          </w:tcPr>
+          <w:p>
+            <w:pPr>
+              <w:spacing w:after="0"/>
+              <w:jc w:val="left"/>
+            </w:pPr>
+            <w:r>
+              <w:rPr>
+                <w:rFonts w:ascii="Aptos" w:hAnsi="Aptos" w:eastAsia="Aptos"/>
+                <w:color w:val="000000"/>
+                <w:sz w:val="19"/>
+              </w:rPr>
+              <w:t>Принимают релизы; current.json указывает на актуальные четыре PDF.</w:t>
+            </w:r>
+          </w:p>
+        </w:tc>
+        <w:tc>
+          <w:tcPr>
+            <w:tcW w:type="dxa" w:w="3816"/>
+            <w:tcMar>
+              <w:top w:w="110" w:type="dxa"/>
+              <w:start w:w="120" w:type="dxa"/>
+              <w:bottom w:w="110" w:type="dxa"/>
+              <w:end w:w="120" w:type="dxa"/>
+            </w:tcMar>
+            <w:vAlign w:val="center"/>
+          </w:tcPr>
+          <w:p>
+            <w:pPr>
+              <w:spacing w:after="0"/>
+              <w:jc w:val="left"/>
+            </w:pPr>
+            <w:r>
+              <w:rPr>
+                <w:rFonts w:ascii="Aptos" w:hAnsi="Aptos" w:eastAsia="Aptos"/>
+                <w:color w:val="000000"/>
+                <w:sz w:val="19"/>
+              </w:rPr>
+              <w:t>Архив отделён от рабочих правок и доставляет комплект на выставку.</w:t>
+            </w:r>
+          </w:p>
+        </w:tc>
+      </w:tr>
+      <w:tr>
+        <w:trPr>
+          <w:cantSplit/>
+        </w:trPr>
+        <w:tc>
+          <w:tcPr>
+            <w:tcW w:type="dxa" w:w="1944"/>
+            <w:shd w:fill="EEF4F8"/>
+            <w:tcMar>
+              <w:top w:w="110" w:type="dxa"/>
+              <w:start w:w="120" w:type="dxa"/>
+              <w:bottom w:w="110" w:type="dxa"/>
+              <w:end w:w="120" w:type="dxa"/>
+            </w:tcMar>
+            <w:vAlign w:val="center"/>
+          </w:tcPr>
+          <w:p>
+            <w:pPr>
+              <w:spacing w:after="0"/>
+              <w:jc w:val="center"/>
+            </w:pPr>
+            <w:r>
+              <w:rPr>
+                <w:rFonts w:ascii="Aptos" w:hAnsi="Aptos" w:eastAsia="Aptos"/>
+                <w:color w:val="000000"/>
+                <w:sz w:val="19"/>
+              </w:rPr>
+              <w:t>Десктопное приложение</w:t>
+            </w:r>
+          </w:p>
+        </w:tc>
+        <w:tc>
+          <w:tcPr>
+            <w:tcW w:type="dxa" w:w="3960"/>
+            <w:shd w:fill="EEF4F8"/>
+            <w:tcMar>
+              <w:top w:w="110" w:type="dxa"/>
+              <w:start w:w="120" w:type="dxa"/>
+              <w:bottom w:w="110" w:type="dxa"/>
+              <w:end w:w="120" w:type="dxa"/>
+            </w:tcMar>
+            <w:vAlign w:val="center"/>
+          </w:tcPr>
+          <w:p>
+            <w:pPr>
+              <w:spacing w:after="0"/>
+              <w:jc w:val="left"/>
+            </w:pPr>
+            <w:r>
+              <w:rPr>
+                <w:rFonts w:ascii="Aptos" w:hAnsi="Aptos" w:eastAsia="Aptos"/>
+                <w:color w:val="000000"/>
+                <w:sz w:val="19"/>
+              </w:rPr>
+              <w:t>На ПК 1 проверяет, резервирует и целиком устанавливает четыре PDF. Остальные ПК работают через локальную сеть.</w:t>
+            </w:r>
+          </w:p>
+        </w:tc>
+        <w:tc>
+          <w:tcPr>
+            <w:tcW w:type="dxa" w:w="3816"/>
+            <w:shd w:fill="EEF4F8"/>
+            <w:tcMar>
+              <w:top w:w="110" w:type="dxa"/>
+              <w:start w:w="120" w:type="dxa"/>
+              <w:bottom w:w="110" w:type="dxa"/>
+              <w:end w:w="120" w:type="dxa"/>
+            </w:tcMar>
+            <w:vAlign w:val="center"/>
+          </w:tcPr>
+          <w:p>
+            <w:pPr>
+              <w:spacing w:after="0"/>
+              <w:jc w:val="left"/>
+            </w:pPr>
+            <w:r>
+              <w:rPr>
+                <w:rFonts w:ascii="Aptos" w:hAnsi="Aptos" w:eastAsia="Aptos"/>
+                <w:color w:val="000000"/>
+                <w:sz w:val="19"/>
+              </w:rPr>
+              <w:t>Не возникает смеси версий, а последний комплект работает без интернета.</w:t>
+            </w:r>
+          </w:p>
+        </w:tc>
+      </w:tr>
+    </w:tbl>
+    <w:p>
+      <w:pPr>
+        <w:spacing w:after="40"/>
+      </w:pPr>
+    </w:p>
+    <w:p>
+      <w:pPr>
+        <w:pStyle w:val="Heading2"/>
+        <w:keepNext/>
+      </w:pPr>
+      <w:r>
+        <w:t>Почему система была нужна</w:t>
+      </w:r>
+    </w:p>
+    <w:p>
+      <w:pPr>
+        <w:pStyle w:val="ListBullet"/>
+        <w:spacing w:after="60" w:line="259" w:lineRule="auto"/>
+      </w:pPr>
+      <w:r>
+        <w:rPr>
+          <w:rFonts w:ascii="Aptos" w:hAnsi="Aptos" w:eastAsia="Aptos"/>
+          <w:color w:val="000000"/>
+        </w:rPr>
+        <w:t>единый шаблон синхронизирует геометрию во всех четырёх документах и исключает ручное повторение одной правки на 56 разворотах</w:t>
+      </w:r>
+    </w:p>
+    <w:p>
+      <w:pPr>
+        <w:pStyle w:val="ListBullet"/>
+        <w:spacing w:after="60" w:line="259" w:lineRule="auto"/>
+      </w:pPr>
+      <w:r>
+        <w:rPr>
+          <w:rFonts w:ascii="Aptos" w:hAnsi="Aptos" w:eastAsia="Aptos"/>
+          <w:color w:val="000000"/>
+        </w:rPr>
+        <w:t>одновременная работа нескольких сотрудников не приводит к перезаписи чужого текста и появлению параллельных копий файла</w:t>
+      </w:r>
+    </w:p>
+    <w:p>
+      <w:pPr>
+        <w:pStyle w:val="ListBullet"/>
+        <w:spacing w:after="60" w:line="259" w:lineRule="auto"/>
+      </w:pPr>
+      <w:r>
+        <w:rPr>
+          <w:rFonts w:ascii="Aptos" w:hAnsi="Aptos" w:eastAsia="Aptos"/>
+          <w:color w:val="000000"/>
+        </w:rPr>
+        <w:t>роли editor, publisher и admin разделяют редактирование, публикацию и администрирование</w:t>
+      </w:r>
+    </w:p>
+    <w:p>
+      <w:pPr>
+        <w:pStyle w:val="ListBullet"/>
+        <w:spacing w:after="60" w:line="259" w:lineRule="auto"/>
+      </w:pPr>
+      <w:r>
+        <w:rPr>
+          <w:rFonts w:ascii="Aptos" w:hAnsi="Aptos" w:eastAsia="Aptos"/>
+          <w:color w:val="000000"/>
+        </w:rPr>
+        <w:t>история версий позволяет вернуть сохранённое состояние после ошибочной правки</w:t>
+      </w:r>
+    </w:p>
+    <w:p>
+      <w:pPr>
+        <w:pStyle w:val="ListBullet"/>
+        <w:spacing w:after="60" w:line="259" w:lineRule="auto"/>
+      </w:pPr>
+      <w:r>
+        <w:rPr>
+          <w:rFonts w:ascii="Aptos" w:hAnsi="Aptos" w:eastAsia="Aptos"/>
+          <w:color w:val="000000"/>
+        </w:rPr>
+        <w:t>публикация создаёт единый неизменяемый комплект из четырёх PDF с контрольными суммами</w:t>
+      </w:r>
+    </w:p>
+    <w:p>
+      <w:pPr>
+        <w:pStyle w:val="ListBullet"/>
+        <w:spacing w:after="60" w:line="259" w:lineRule="auto"/>
+      </w:pPr>
+      <w:r>
+        <w:rPr>
+          <w:rFonts w:ascii="Aptos" w:hAnsi="Aptos" w:eastAsia="Aptos"/>
+          <w:color w:val="000000"/>
+        </w:rPr>
+        <w:t>десктопное приложение устанавливает комплект целиком и сохраняет предыдущую версию для восстановления</w:t>
+      </w:r>
+    </w:p>
+    <w:p>
+      <w:pPr>
+        <w:pStyle w:val="Heading2"/>
+        <w:keepNext/>
+      </w:pPr>
+      <w:r>
+        <w:t>Как материал попадает из редактора на выставку</w:t>
+      </w:r>
+    </w:p>
+    <w:p>
+      <w:pPr>
+        <w:spacing w:after="100" w:line="264" w:lineRule="auto"/>
+        <w:ind w:left="461" w:hanging="461"/>
+      </w:pPr>
+      <w:r>
+        <w:rPr>
+          <w:rFonts w:ascii="Aptos" w:hAnsi="Aptos" w:eastAsia="Aptos"/>
+          <w:color w:val="000000"/>
+        </w:rPr>
+        <w:t xml:space="preserve">1.  </w:t>
+      </w:r>
+      <w:r>
+        <w:rPr>
+          <w:rFonts w:ascii="Aptos" w:hAnsi="Aptos" w:eastAsia="Aptos"/>
+          <w:color w:val="000000"/>
+        </w:rPr>
+        <w:t>Музейный сотрудник открывает Postcards Studio через домен mess-studio.ru, входит под личной учётной записью и редактирует нужный документ.</w:t>
+      </w:r>
+    </w:p>
+    <w:p>
+      <w:pPr>
+        <w:spacing w:after="100" w:line="264" w:lineRule="auto"/>
+        <w:ind w:left="461" w:hanging="461"/>
+      </w:pPr>
+      <w:r>
+        <w:rPr>
+          <w:rFonts w:ascii="Aptos" w:hAnsi="Aptos" w:eastAsia="Aptos"/>
+          <w:color w:val="000000"/>
+        </w:rPr>
+        <w:t xml:space="preserve">2.  </w:t>
+      </w:r>
+      <w:r>
+        <w:rPr>
+          <w:rFonts w:ascii="Aptos" w:hAnsi="Aptos" w:eastAsia="Aptos"/>
+          <w:color w:val="000000"/>
+        </w:rPr>
+        <w:t>Сервис сохраняет рабочее состояние и контрольные версии. Общий шаблон применяется ко всем четырём документам без подмены их текстов и сканов.</w:t>
+      </w:r>
+    </w:p>
+    <w:p>
+      <w:pPr>
+        <w:spacing w:after="100" w:line="264" w:lineRule="auto"/>
+        <w:ind w:left="461" w:hanging="461"/>
+      </w:pPr>
+      <w:r>
+        <w:rPr>
+          <w:rFonts w:ascii="Aptos" w:hAnsi="Aptos" w:eastAsia="Aptos"/>
+          <w:color w:val="000000"/>
+        </w:rPr>
+        <w:t xml:space="preserve">3.  </w:t>
+      </w:r>
+      <w:r>
+        <w:rPr>
+          <w:rFonts w:ascii="Aptos" w:hAnsi="Aptos" w:eastAsia="Aptos"/>
+          <w:color w:val="000000"/>
+        </w:rPr>
+        <w:t>Пользователь с правом публикации проверяет все документы и создаёт комплект. Сервер собирает четыре PDF, манифест и контрольные суммы.</w:t>
+      </w:r>
+    </w:p>
+    <w:p>
+      <w:pPr>
+        <w:spacing w:after="100" w:line="264" w:lineRule="auto"/>
+        <w:ind w:left="461" w:hanging="461"/>
+      </w:pPr>
+      <w:r>
+        <w:rPr>
+          <w:rFonts w:ascii="Aptos" w:hAnsi="Aptos" w:eastAsia="Aptos"/>
+          <w:color w:val="000000"/>
+        </w:rPr>
+        <w:t xml:space="preserve">4.  </w:t>
+      </w:r>
+      <w:r>
+        <w:rPr>
+          <w:rFonts w:ascii="Aptos" w:hAnsi="Aptos" w:eastAsia="Aptos"/>
+          <w:color w:val="000000"/>
+        </w:rPr>
+        <w:t>Опубликованный релиз передаётся в общую папку NAS и Яндекс Диска. Указатель current.json обновляется только после загрузки всех файлов.</w:t>
+      </w:r>
+    </w:p>
+    <w:p>
+      <w:pPr>
+        <w:spacing w:after="100" w:line="264" w:lineRule="auto"/>
+        <w:ind w:left="461" w:hanging="461"/>
+      </w:pPr>
+      <w:r>
+        <w:rPr>
+          <w:rFonts w:ascii="Aptos" w:hAnsi="Aptos" w:eastAsia="Aptos"/>
+          <w:color w:val="000000"/>
+        </w:rPr>
+        <w:t xml:space="preserve">5.  </w:t>
+      </w:r>
+      <w:r>
+        <w:rPr>
+          <w:rFonts w:ascii="Aptos" w:hAnsi="Aptos" w:eastAsia="Aptos"/>
+          <w:color w:val="000000"/>
+        </w:rPr>
+        <w:t>На ПК 1 оператор нажимает Синхронизировать все документы. Приложение проверяет комплект, сохраняет резервную копию и заменяет сразу все четыре PDF.</w:t>
+      </w:r>
+    </w:p>
+    <w:p>
+      <w:pPr>
+        <w:spacing w:after="100" w:line="264" w:lineRule="auto"/>
+        <w:ind w:left="461" w:hanging="461"/>
+      </w:pPr>
+      <w:r>
+        <w:rPr>
+          <w:rFonts w:ascii="Aptos" w:hAnsi="Aptos" w:eastAsia="Aptos"/>
+          <w:color w:val="000000"/>
+        </w:rPr>
+        <w:t xml:space="preserve">6.  </w:t>
+      </w:r>
+      <w:r>
+        <w:rPr>
+          <w:rFonts w:ascii="Aptos" w:hAnsi="Aptos" w:eastAsia="Aptos"/>
+          <w:color w:val="000000"/>
+        </w:rPr>
+        <w:t>ПК 1 координирует ПК 2, ПК 3 и ПК 4 по локальной сети. Для показа используется локальная копия, поэтому краткий сбой интернета не останавливает инсталляцию.</w:t>
+      </w:r>
+    </w:p>
+    <w:p>
+      <w:pPr>
+        <w:pStyle w:val="Heading2"/>
+        <w:keepNext/>
+      </w:pPr>
+      <w:r>
+        <w:t>Что зависит от интернета и что работает локально</w:t>
+      </w:r>
+    </w:p>
+    <w:p>
+      <w:pPr>
+        <w:spacing w:after="120" w:line="269" w:lineRule="auto"/>
+      </w:pPr>
+      <w:r>
+        <w:rPr>
+          <w:rFonts w:ascii="Aptos" w:hAnsi="Aptos" w:eastAsia="Aptos"/>
+          <w:i w:val="0"/>
+          <w:color w:val="000000"/>
+        </w:rPr>
+        <w:t>Интернет нужен для входа в Postcards Studio, совместного редактирования, загрузки сканов и публикации. Доступность домена не требуется для уже запущенного показа: после успешной синхронизации четыре PDF находятся на ПК 1, а компьютеры инсталляции обмениваются командами внутри локальной сети. Если опубликован новый комплект, но ПК 1 ещё не выполнил синхронизацию, выставка продолжит использовать прежнюю проверенную версию.</w:t>
       </w:r>
     </w:p>
     <w:p>

</xml_diff>